<commit_message>
Resuelve 3 pendientes de auditoria: tipografia, papeleria, gris de apoyo
</commit_message>
<xml_diff>
--- a/MejoraContinua-Marca/01_DOCUMENTOS/00_IDENTIDAD_VISUAL.docx
+++ b/MejoraContinua-Marca/01_DOCUMENTOS/00_IDENTIDAD_VISUAL.docx
@@ -154,7 +154,7 @@
           <w:rFonts w:ascii="Bw Modelica" w:cs="Bw Modelica" w:eastAsia="Bw Modelica" w:hAnsi="Bw Modelica"/>
           <w:i/>
           <w:iCs/>
-          <w:color w:val="6B6B6B"/>
+          <w:color w:val="6B7280"/>
           <w:sz w:val="18"/>
           <w:szCs w:val="18"/>
         </w:rPr>
@@ -231,7 +231,7 @@
           <w:rFonts w:ascii="Bw Modelica" w:cs="Bw Modelica" w:eastAsia="Bw Modelica" w:hAnsi="Bw Modelica"/>
           <w:i/>
           <w:iCs/>
-          <w:color w:val="6B6B6B"/>
+          <w:color w:val="6B7280"/>
           <w:sz w:val="18"/>
           <w:szCs w:val="18"/>
         </w:rPr>
@@ -308,7 +308,7 @@
           <w:rFonts w:ascii="Bw Modelica" w:cs="Bw Modelica" w:eastAsia="Bw Modelica" w:hAnsi="Bw Modelica"/>
           <w:i/>
           <w:iCs/>
-          <w:color w:val="6B6B6B"/>
+          <w:color w:val="6B7280"/>
           <w:sz w:val="18"/>
           <w:szCs w:val="18"/>
         </w:rPr>
@@ -385,7 +385,7 @@
           <w:rFonts w:ascii="Bw Modelica" w:cs="Bw Modelica" w:eastAsia="Bw Modelica" w:hAnsi="Bw Modelica"/>
           <w:i/>
           <w:iCs/>
-          <w:color w:val="6B6B6B"/>
+          <w:color w:val="6B7280"/>
           <w:sz w:val="18"/>
           <w:szCs w:val="18"/>
         </w:rPr>
@@ -624,7 +624,7 @@
             <w:r>
               <w:rPr>
                 <w:rFonts w:ascii="Bw Modelica" w:cs="Bw Modelica" w:eastAsia="Bw Modelica" w:hAnsi="Bw Modelica"/>
-                <w:color w:val="6B6B6B"/>
+                <w:color w:val="6B7280"/>
                 <w:sz w:val="18"/>
                 <w:szCs w:val="18"/>
               </w:rPr>
@@ -673,7 +673,7 @@
             <w:r>
               <w:rPr>
                 <w:rFonts w:ascii="Bw Modelica" w:cs="Bw Modelica" w:eastAsia="Bw Modelica" w:hAnsi="Bw Modelica"/>
-                <w:color w:val="6B6B6B"/>
+                <w:color w:val="6B7280"/>
                 <w:sz w:val="18"/>
                 <w:szCs w:val="18"/>
               </w:rPr>
@@ -722,7 +722,7 @@
             <w:r>
               <w:rPr>
                 <w:rFonts w:ascii="Bw Modelica" w:cs="Bw Modelica" w:eastAsia="Bw Modelica" w:hAnsi="Bw Modelica"/>
-                <w:color w:val="6B6B6B"/>
+                <w:color w:val="6B7280"/>
                 <w:sz w:val="18"/>
                 <w:szCs w:val="18"/>
               </w:rPr>
@@ -785,7 +785,7 @@
         <w:tc>
           <w:tcPr>
             <w:tcW w:type="dxa" w:w="3008"/>
-            <w:shd w:fill="6B6B6B" w:val="clear"/>
+            <w:shd w:fill="6B7280" w:val="clear"/>
             <w:tcMar>
               <w:top w:type="dxa" w:w="800"/>
               <w:left w:type="dxa" w:w="120"/>
@@ -851,7 +851,7 @@
             <w:r>
               <w:rPr>
                 <w:rFonts w:ascii="Bw Modelica" w:cs="Bw Modelica" w:eastAsia="Bw Modelica" w:hAnsi="Bw Modelica"/>
-                <w:color w:val="6B6B6B"/>
+                <w:color w:val="6B7280"/>
                 <w:sz w:val="18"/>
                 <w:szCs w:val="18"/>
               </w:rPr>
@@ -893,18 +893,18 @@
                 <w:sz w:val="18"/>
                 <w:szCs w:val="18"/>
               </w:rPr>
-              <w:t xml:space="preserve">#6B6B6B</w:t>
-            </w:r>
-          </w:p>
-          <w:p>
-            <w:r>
-              <w:rPr>
-                <w:rFonts w:ascii="Bw Modelica" w:cs="Bw Modelica" w:eastAsia="Bw Modelica" w:hAnsi="Bw Modelica"/>
-                <w:color w:val="6B6B6B"/>
+              <w:t xml:space="preserve">#6B7280</w:t>
+            </w:r>
+          </w:p>
+          <w:p>
+            <w:r>
+              <w:rPr>
+                <w:rFonts w:ascii="Bw Modelica" w:cs="Bw Modelica" w:eastAsia="Bw Modelica" w:hAnsi="Bw Modelica"/>
+                <w:color w:val="6B7280"/>
                 <w:sz w:val="18"/>
                 <w:szCs w:val="18"/>
               </w:rPr>
-              <w:t xml:space="preserve">rgb(107, 107, 107)</w:t>
+              <w:t xml:space="preserve">rgb(107, 114, 128)</w:t>
             </w:r>
           </w:p>
         </w:tc>
@@ -949,7 +949,7 @@
             <w:r>
               <w:rPr>
                 <w:rFonts w:ascii="Bw Modelica" w:cs="Bw Modelica" w:eastAsia="Bw Modelica" w:hAnsi="Bw Modelica"/>
-                <w:color w:val="6B6B6B"/>
+                <w:color w:val="6B7280"/>
                 <w:sz w:val="18"/>
                 <w:szCs w:val="18"/>
               </w:rPr>
@@ -1157,7 +1157,7 @@
           <w:sz w:val="30"/>
           <w:szCs w:val="30"/>
         </w:rPr>
-        <w:t xml:space="preserve">Pendientes</w:t>
+        <w:t xml:space="preserve">Alcance</w:t>
       </w:r>
     </w:p>
     <w:p>
@@ -1171,7 +1171,7 @@
           <w:sz w:val="22"/>
           <w:szCs w:val="22"/>
         </w:rPr>
-        <w:t xml:space="preserve">Papelería física (tarjetas personales, membrete, sobres) y cartelería de oficina — quedan para una siguiente entrega de este manual, no bloquean lo digital.</w:t>
+        <w:t xml:space="preserve">Papelería física (tarjetas personales, membrete, sobres) y cartelería de oficina están dentro del alcance de este manual, igual que las piezas digitales — ver Criterio Medular.</w:t>
       </w:r>
     </w:p>
     <w:sectPr>

</xml_diff>